<commit_message>
Apply BGV authorization template and post-signature lock updates
</commit_message>
<xml_diff>
--- a/AuthorizationLetter_Template.docx
+++ b/AuthorizationLetter_Template.docx
@@ -410,7 +410,7 @@
                     <w:sz w:val="20"/>
                     <w:szCs w:val="20"/>
                   </w:rPr>
-                  <w:t>Click or tap here to enter text.</w:t>
+                  <w:t>N/A</w:t>
                 </w:r>
               </w:sdtContent>
             </w:sdt>
@@ -532,7 +532,7 @@
                     <w:sz w:val="20"/>
                     <w:szCs w:val="20"/>
                   </w:rPr>
-                  <w:t>Click or tap here to enter text.</w:t>
+                  <w:t>N/A</w:t>
                 </w:r>
               </w:sdtContent>
             </w:sdt>
@@ -734,11 +734,46 @@
     </w:tbl>
     <w:p>
       <w:pPr>
+        <w:jc w:val="left"/>
         <w:rPr>
-          <w:rFonts w:asciiTheme="minorHAnsi" w:eastAsiaTheme="minorEastAsia" w:hAnsiTheme="minorHAnsi"/>
+          <w:rFonts w:eastAsiaTheme="minorEastAsia"/>
           <w:noProof/>
+          <w:sz w:val="20"/>
+          <w:szCs w:val="20"/>
         </w:rPr>
       </w:pPr>
+      <w:r>
+        <w:rPr>
+          <w:sz w:val="20"/>
+          <w:szCs w:val="20"/>
+        </w:rPr>
+        <w:t xml:space="preserve">Yes, I authorized </w:t>
+      </w:r>
+      <w:sdt>
+        <w:sdtPr>
+          <w:rPr>
+            <w:sz w:val="20"/>
+            <w:szCs w:val="20"/>
+          </w:rPr>
+          <w:alias w:val="SignedYes"/>
+          <w:tag w:val="SignedYes"/>
+          <w:id w:val="213457001"/>
+          <w14:checkbox>
+            <w14:checked w14:val="0"/>
+            <w14:checkedState w14:val="2612" w14:font="MS Gothic"/>
+            <w14:uncheckedState w14:val="2610" w14:font="MS Gothic"/>
+          </w14:checkbox>
+        </w:sdtPr>
+        <w:sdtEndPr/>
+        <w:sdtContent>
+          <w:r>
+            <w:rPr>
+              <w:noProof/>
+            </w:rPr>
+            <w:t>☐</w:t>
+          </w:r>
+        </w:sdtContent>
+      </w:sdt>
     </w:p>
     <w:sectPr>
       <w:headerReference w:type="default" r:id="rId9"/>

</xml_diff>